<commit_message>
added dealer edit and delete
</commit_message>
<xml_diff>
--- a/contracts/tax_invoice_template.docx
+++ b/contracts/tax_invoice_template.docx
@@ -1007,7 +1007,21 @@
                 <w:sz w:val="24"/>
                 <w:szCs w:val="24"/>
               </w:rPr>
-              <w:t>== true)</w:t>
+              <w:t xml:space="preserve">== </w:t>
+            </w:r>
+            <w:r>
+              <w:rPr>
+                <w:sz w:val="24"/>
+                <w:szCs w:val="24"/>
+              </w:rPr>
+              <w:t>‘on’</w:t>
+            </w:r>
+            <w:r>
+              <w:rPr>
+                <w:sz w:val="24"/>
+                <w:szCs w:val="24"/>
+              </w:rPr>
+              <w:t>)</w:t>
             </w:r>
             <w:r>
               <w:rPr>

</xml_diff>

<commit_message>
navbar items row in mobile and logo change
</commit_message>
<xml_diff>
--- a/contracts/tax_invoice_template.docx
+++ b/contracts/tax_invoice_template.docx
@@ -1612,9 +1612,9 @@
       </w:rPr>
       <w:drawing>
         <wp:inline distT="0" distB="0" distL="0" distR="0">
-          <wp:extent cx="666750" cy="638256"/>
-          <wp:effectExtent l="19050" t="0" r="0" b="0"/>
-          <wp:docPr id="1" name="Picture 0" descr="icon.png"/>
+          <wp:extent cx="548093" cy="395654"/>
+          <wp:effectExtent l="0" t="0" r="4357" b="0"/>
+          <wp:docPr id="3" name="Picture 2" descr="output-onlinepngtools.png"/>
           <wp:cNvGraphicFramePr>
             <a:graphicFrameLocks xmlns:a="http://schemas.openxmlformats.org/drawingml/2006/main" noChangeAspect="1"/>
           </wp:cNvGraphicFramePr>
@@ -1622,7 +1622,7 @@
             <a:graphicData uri="http://schemas.openxmlformats.org/drawingml/2006/picture">
               <pic:pic xmlns:pic="http://schemas.openxmlformats.org/drawingml/2006/picture">
                 <pic:nvPicPr>
-                  <pic:cNvPr id="0" name="icon.png"/>
+                  <pic:cNvPr id="0" name="output-onlinepngtools.png"/>
                   <pic:cNvPicPr/>
                 </pic:nvPicPr>
                 <pic:blipFill>
@@ -1634,7 +1634,7 @@
                 <pic:spPr>
                   <a:xfrm>
                     <a:off x="0" y="0"/>
-                    <a:ext cx="666667" cy="638176"/>
+                    <a:ext cx="548640" cy="396049"/>
                   </a:xfrm>
                   <a:prstGeom prst="rect">
                     <a:avLst/>

</xml_diff>